<commit_message>
internal snapshot 2026-09-16 19:43
</commit_message>
<xml_diff>
--- a/srs/SRS.docx
+++ b/srs/SRS.docx
@@ -105,7 +105,7 @@
       <w:pPr/>
       <w:r>
         <w:rPr/>
-        <w:t xml:space="preserve">In scope: plain-English question intake; candidate SQL generation (mock default, live LLM optional); a deterministic validation gate (9 rules, actions BLOCK / MASK / SUGGEST) operating on a parsed SQL AST; compound-statement verification per arm; sensitive-column side-channel blocking; a gate-only executor over a read-only connection; an append-only audit log; an evaluation harness (labeled corpus + metamorphic relations); a plain-language web UI. Out of scope (kept out so Project 2 stays feasible): live-LLM prompt-engineering quality work, user account management, multi-database support beyond SQLite, deployment beyond a single demo machine, model-side defenses.</w:t>
+        <w:t xml:space="preserve">In scope: plain-English question intake; candidate SQL generation (mock default, live LLM optional); a deterministic validation gate (8 enforced rules + a parse-fail safe default; stretch rule G-10 pending; actions BLOCK / MASK / SUGGEST) operating on a parsed SQL AST; compound-statement verification per arm; sensitive-column side-channel blocking; a gate-only executor over a read-only connection; an append-only audit log; an evaluation harness (labeled corpus + metamorphic relations); a plain-language web UI. Out of scope (kept out so Project 2 stays feasible): live-LLM prompt-engineering quality work, user account management, multi-database support beyond SQLite, deployment beyond a single demo machine, model-side defenses.</w:t>
       </w:r>
     </w:p>
     <w:p>
@@ -1322,7 +1322,7 @@
         <w:t xml:space="preserve">FR-U3 (Explain view):</w:t>
       </w:r>
       <w:r>
-        <w:t xml:space="preserve"> a "How it works" page states the three-step flow and all nine rules in plain language, so no internal id is required to understand a verdict (plain names owned by </w:t>
+        <w:t xml:space="preserve"> a "How it works" page states the three-step flow and the rule set in plain language, so no internal id is required to understand a verdict (plain names owned by </w:t>
       </w:r>
       <w:r>
         <w:rPr>

</xml_diff>